<commit_message>
feat(security,reports): implement CSRF, fix authorization, align thesis docs & benchmarks
</commit_message>
<xml_diff>
--- a/Bao_cao_DATN_Website_Thuong_Mai_Dien_Tu_Thiet_Bi_Dien_Tu.docx
+++ b/Bao_cao_DATN_Website_Thuong_Mai_Dien_Tu_Thiet_Bi_Dien_Tu.docx
@@ -424,7 +424,7 @@
           <w:rFonts w:ascii="Times New Roman" w:hAnsi="Times New Roman"/>
           <w:sz w:val="24"/>
         </w:rPr>
-        <w:t>• 2.7.2. Thuật toán tìm kiếm xấp xỉ chuỗi (Fuzzy Levenshtein &amp; TF-IDF)</w:t>
+        <w:t>• 2.7.2. Thuật toán tìm kiếm xấp xỉ chuỗi (Fuzzy Search kết hợp Levenshtein Distance và Token Matching)</w:t>
       </w:r>
     </w:p>
     <w:p>
@@ -988,7 +988,7 @@
           <w:rFonts w:ascii="Times New Roman" w:hAnsi="Times New Roman"/>
           <w:sz w:val="26"/>
         </w:rPr>
-        <w:t>Xuất phát từ thực tiễn trên, đồ án lựa chọn đề tài: **“Xây dựng Website Thương mại Điện tử Thiết bị Điện tử với Kiến trúc Hybrid PHP và Rust Engine Hiệu Năng Cao”**. Đề tài phát huy tối đa thế mạnh của **PHP** trong việc xây dựng ứng dụng web nhanh chóng, dễ bảo trì theo mô hình MVC, đồng thời tích hợp dịch vụ phụ trợ bằng **Rust** – một ngôn ngữ lập trình hệ thống hiện đại, an toàn bộ nhớ (memory-safe), tốc độ thực thi gần sát kim loại (bare-metal) và đa luồng mạnh mẽ – để giải quyết triệt để bài toán hiệu năng trong môi trường thương mại điện tử.</w:t>
+        <w:t>Xuất phát từ thực tiễn trên, đồ án lựa chọn đề tài: **“Xây dựng Website Thương mại Điện tử Thiết bị Điện tử với Kiến trúc Hybrid PHP và Rust Engine Hiệu Năng Cao”**. Đề tài phát huy tối đa thế mạnh của **PHP** trong việc xây dựng ứng dụng web nhanh chóng, dễ bảo trì theo mô hình MVC, đồng thời tích hợp dịch vụ phụ trợ bằng **Rust** – một ngôn ngữ lập trình hệ thống hiện đại, an toàn bộ nhớ (memory-safe), tốc độ thực thi bare-metal – nhằm tối ưu hóa hiệu năng tính toán thuật toán trong môi trường thương mại điện tử.</w:t>
       </w:r>
     </w:p>
     <w:p>
@@ -1068,7 +1068,7 @@
           <w:rFonts w:ascii="Times New Roman" w:hAnsi="Times New Roman"/>
           <w:sz w:val="24"/>
         </w:rPr>
-        <w:t>• Xây dựng cơ chế **Graceful Fallback**: Trong trường hợp dịch vụ Rust bảo trì hoặc ngoại tuyến, hệ thống PHP tự động kích hoạt thuật toán dự phòng nội bộ, đảm bảo tính liên tục 100% của hệ sinh thái web.</w:t>
+        <w:t>• Xây dựng cơ chế **Graceful Fallback**: Trong trường hợp dịch vụ Rust bảo trì hoặc ngoại tuyến, hệ thống PHP tự động kích hoạt thuật toán dự phòng nội bộ, đảm bảo tính liên tục và độ ổn định cao của hệ sinh thái web.</w:t>
       </w:r>
     </w:p>
     <w:p>
@@ -1618,7 +1618,7 @@
           <w:rFonts w:ascii="Times New Roman" w:hAnsi="Times New Roman"/>
           <w:sz w:val="26"/>
         </w:rPr>
-        <w:t>PHP (PHP: Hypertext Preprocessor) là ngôn ngữ lập trình kịch bản phía máy chủ mạnh mẽ và phổ biến nhất trong hệ sinh thái thương mại điện tử toàn cầu. Phiên bản PHP 8.x mang lại nhiều cải tiến mang tính đột phá:</w:t>
+        <w:t>PHP (PHP: Hypertext Preprocessor) là ngôn ngữ lập trình kịch bản phía máy chủ mạnh mẽ và phổ biến nhất trong hệ sinh thái thương mại điện tử toàn cầu. Phiên bản PHP 8.x mang lại nhiều cải tiến quan trọng về hiệu năng và cú pháp:</w:t>
       </w:r>
     </w:p>
     <w:p>
@@ -1657,7 +1657,7 @@
           <w:rFonts w:ascii="Times New Roman" w:hAnsi="Times New Roman"/>
           <w:sz w:val="24"/>
         </w:rPr>
-        <w:t>• Cơ chế quản lý phiên làm việc (`$_SESSION`) an toàn và tích hợp sẵn chuẩn mã hóa băm mật khẩu `PASSWORD_DEFAULT` (sử dụng thuật toán Bcrypt) với chi phí mã hóa (cost) cao, bảo vệ tuyệt đối thông tin người dùng trước các cuộc tấn công tra từ điển (Rainbow Tables).</w:t>
+        <w:t>• Cơ chế quản lý phiên làm việc (`$_SESSION`) an toàn và tích hợp sẵn chuẩn mã hóa băm mật khẩu `PASSWORD_DEFAULT` (sử dụng thuật toán Bcrypt) với chi phí mã hóa (cost) cao, bảo vệ an toàn thông tin người dùng trước các cuộc tấn công tra từ điển (Rainbow Tables).</w:t>
       </w:r>
     </w:p>
     <w:p>
@@ -1793,7 +1793,7 @@
           <w:rFonts w:ascii="Times New Roman" w:hAnsi="Times New Roman"/>
           <w:sz w:val="24"/>
         </w:rPr>
-        <w:t>• **Bảo mật tuyệt đối trước SQL Injection:** Toàn bộ tham số người dùng nhập vào đều được truyền qua cơ chế Tham số hóa (Prepared Statements) và ràng buộc giá trị (Parameterized Binding), triệt tiêu hoàn toàn nguy cơ chèn mã độc vào câu lệnh SQL.</w:t>
+        <w:t>• **Phòng chống tấn công SQL Injection:** Toàn bộ tham số người dùng nhập vào đều được thực thi qua cơ chế Tham số hóa (Prepared Statements) và ràng buộc giá trị (`bindValue` / `execute([$param])`), kết hợp cấu hình `PDO::ATTR_EMULATE_PREPARES =&gt; false` nhằm ngăn chặn nguy cơ chèn mã độc vào câu lệnh SQL.</w:t>
       </w:r>
     </w:p>
     <w:p>
@@ -1927,7 +1927,7 @@
           <w:rFonts w:ascii="Times New Roman" w:hAnsi="Times New Roman"/>
           <w:sz w:val="24"/>
         </w:rPr>
-        <w:t>• **Đa luồng không sợ hãi (Fearless Concurrency):** Rust cho phép triển khai các tác vụ tính toán song song trên nhiều nhân CPU mà không lo ngại xảy ra xung đột dữ liệu giữa các luồng.</w:t>
+        <w:t>• **Khả năng xử lý tác vụ hiệu năng cao:** Rust cung cấp hệ sinh thái tính toán hiệu năng cao với chi phí tài nguyên cực thấp, thích hợp để xây dựng các microservice chuyên trách các thuật toán phức tạp.</w:t>
       </w:r>
     </w:p>
     <w:p>
@@ -2288,20 +2288,72 @@
           <w:color w:val="2563EB"/>
           <w:sz w:val="26"/>
         </w:rPr>
-        <w:t>2.7.2. Thuật toán tìm kiếm xấp xỉ chuỗi (Fuzzy Levenshtein &amp; TF-IDF)</w:t>
-      </w:r>
-    </w:p>
-    <w:p>
-      <w:pPr>
-        <w:jc w:val="both"/>
-        <w:spacing w:line="360" w:lineRule="auto" w:after="100"/>
-      </w:pPr>
-      <w:r>
-        <w:rPr>
-          <w:rFonts w:ascii="Times New Roman" w:hAnsi="Times New Roman"/>
-          <w:sz w:val="26"/>
-        </w:rPr>
-        <w:t>Người tiêu dùng khi tìm kiếm thiết bị điện tử thường gõ sai chính tả hoặc gõ tắt (ví dụ: gõ "iphne", "macbok", "smasung"). Hệ thống áp dụng thuật toán tính khoảng cách chỉnh sửa **Levenshtein Distance** để tìm số phép biến đổi tối thiểu (thêm, xóa, thay thế một ký tự) để biến chuỗi $s_1$ thành chuỗi $s_2$:</w:t>
+        <w:t>2.7.2. Thuật toán tìm kiếm xấp xỉ chuỗi (Fuzzy Search kết hợp Levenshtein Distance và Token Matching)</w:t>
+      </w:r>
+    </w:p>
+    <w:p>
+      <w:pPr>
+        <w:jc w:val="both"/>
+        <w:spacing w:line="360" w:lineRule="auto" w:after="100"/>
+      </w:pPr>
+      <w:r>
+        <w:rPr>
+          <w:rFonts w:ascii="Times New Roman" w:hAnsi="Times New Roman"/>
+          <w:sz w:val="26"/>
+        </w:rPr>
+        <w:t>Người tiêu dùng khi tìm kiếm thiết bị điện tử thường gõ sai chính tả hoặc gõ tắt (ví dụ: gõ "iphne", "macbok", "smasung"). Hệ thống áp dụng thuật toán tìm kiếm mờ (Fuzzy Search) đa tầng kết hợp:</w:t>
+      </w:r>
+    </w:p>
+    <w:p>
+      <w:pPr>
+        <w:jc w:val="both"/>
+        <w:spacing w:line="360" w:lineRule="auto" w:after="100"/>
+      </w:pPr>
+      <w:r>
+        <w:rPr>
+          <w:rFonts w:ascii="Times New Roman" w:hAnsi="Times New Roman"/>
+          <w:sz w:val="26"/>
+        </w:rPr>
+        <w:t>1. **Đối sánh cụm từ chính xác (Exact phrase matching):** Ưu tiên cao nhất khi cụm từ người dùng khớp trọn vẹn với tên hoặc mã SKU của thiết bị.</w:t>
+      </w:r>
+    </w:p>
+    <w:p>
+      <w:pPr>
+        <w:jc w:val="both"/>
+        <w:spacing w:line="360" w:lineRule="auto" w:after="100"/>
+      </w:pPr>
+      <w:r>
+        <w:rPr>
+          <w:rFonts w:ascii="Times New Roman" w:hAnsi="Times New Roman"/>
+          <w:sz w:val="26"/>
+        </w:rPr>
+        <w:t>2. **Đối sánh từ tố (Token Matching &amp; Overlap):** Chuỗi truy vấn và tên thiết bị được chuẩn hóa (chuyển chữ thường, loại bỏ ký tự đặc biệt) và phân tách thành các token. Hệ thống tính tỷ lệ giao thoa giữa các tập token để nhận diện sản phẩm dù thứ tự các từ có bị đảo lộn.</w:t>
+      </w:r>
+    </w:p>
+    <w:p>
+      <w:pPr>
+        <w:jc w:val="both"/>
+        <w:spacing w:line="360" w:lineRule="auto" w:after="100"/>
+      </w:pPr>
+      <w:r>
+        <w:rPr>
+          <w:rFonts w:ascii="Times New Roman" w:hAnsi="Times New Roman"/>
+          <w:sz w:val="26"/>
+        </w:rPr>
+        <w:t>3. **Kiểm tra chuỗi con (Substring Containment):** Xác định sự xuất hiện của các token truy vấn trong tên hoặc mô tả ngắn của thiết bị.</w:t>
+      </w:r>
+    </w:p>
+    <w:p>
+      <w:pPr>
+        <w:jc w:val="both"/>
+        <w:spacing w:line="360" w:lineRule="auto" w:after="100"/>
+      </w:pPr>
+      <w:r>
+        <w:rPr>
+          <w:rFonts w:ascii="Times New Roman" w:hAnsi="Times New Roman"/>
+          <w:sz w:val="26"/>
+        </w:rPr>
+        <w:t>4. **Khoảng cách chỉnh sửa Levenshtein (Levenshtein Distance):** Đối với các từ khóa bị gõ sai ký tự, hệ thống tính toán số phép biến đổi tối thiểu (thêm, xóa, thay thế một ký tự) để biến chuỗi $s_1$ thành chuỗi $s_2$:</w:t>
       </w:r>
     </w:p>
     <w:p>
@@ -2444,7 +2496,7 @@
           <w:rFonts w:ascii="Times New Roman" w:hAnsi="Times New Roman"/>
           <w:sz w:val="26"/>
         </w:rPr>
-        <w:t>Kết hợp với kỹ thuật đối sánh token đặc tả kỹ thuật, hệ thống tính toán điểm tương thích tổng hợp và sắp xếp kết quả trả về tức thì dưới 1 mili-giây.</w:t>
+        <w:t>Điểm tương thích tổng hợp (`match_score`) được tính toán dựa trên trọng số tích hợp giữa độ trùng khớp token và khoảng cách Levenshtein, cho phép sắp xếp danh sách kết quả trả về với độ chính xác cao và độ trễ phản hồi thấp.</w:t>
       </w:r>
     </w:p>
     <w:p>
@@ -4502,7 +4554,7 @@
                 <w:rFonts w:ascii="Times New Roman" w:hAnsi="Times New Roman"/>
                 <w:sz w:val="22"/>
               </w:rPr>
-              <w:t>Thời gian phản hồi các tác vụ tính toán tìm kiếm và gợi ý của Rust Engine đạt dưới 2 mili-giây (ms); thời gian tải trang trung bình dưới 500ms.</w:t>
+              <w:t>Thời gian phản hồi các tác vụ tính toán tìm kiếm và gợi ý của Rust Engine đạt mức thấp dưới vài mili-giây; thời gian tải trang trung bình dưới 500ms.</w:t>
             </w:r>
           </w:p>
         </w:tc>
@@ -4573,7 +4625,7 @@
                 <w:rFonts w:ascii="Times New Roman" w:hAnsi="Times New Roman"/>
                 <w:sz w:val="22"/>
               </w:rPr>
-              <w:t>Mật khẩu được mã hóa băm một chiều qua Bcrypt; ngăn chặn 100% SQL Injection nhờ PDO Prepared Statement; bảo vệ chống XSS bằng hàm xử lý ký tự đặc biệt `htmlspecialchars()`.</w:t>
+              <w:t>Mật khẩu được mã hóa băm một chiều qua Bcrypt; phòng vệ trước SQL Injection nhờ Prepared Statements và tắt giả lập câu lệnh PDO; bảo vệ chống XSS bằng `htmlspecialchars()`; trang bị lớp bảo vệ chống tấn công CSRF cho tất cả biểu mẫu POST và chống Session Fixation bằng `session_regenerate_id(true)`.</w:t>
             </w:r>
           </w:p>
         </w:tc>
@@ -5441,7 +5493,7 @@
           <w:rFonts w:ascii="Times New Roman" w:hAnsi="Times New Roman"/>
           <w:sz w:val="26"/>
         </w:rPr>
-        <w:t>4. Rust Engine phân tích đa luồng, tính điểm Levenshtein và đối sánh token, trả về danh sách sản phẩm kèm điểm số tương thích `match_score` chỉ sau 0.8ms.</w:t>
+        <w:t>4. Rust Engine xử lý tính toán native trên bộ nhớ, tính điểm Levenshtein và đối sánh token, trả về danh sách sản phẩm kèm điểm số tương thích `match_score` với độ trễ phản hồi thấp.</w:t>
       </w:r>
     </w:p>
     <w:p>
@@ -7498,7 +7550,7 @@
           <w:rFonts w:ascii="Times New Roman" w:hAnsi="Times New Roman"/>
           <w:sz w:val="26"/>
         </w:rPr>
-        <w:t>5. **`carts` &amp; `cart_items` (Giỏ hàng):** Lưu trữ trạng thái lựa chọn hàng hóa theo phiên làm việc.</w:t>
+        <w:t>5. **`carts` &amp; `cart_items` (Giỏ hàng):** Thiết kế lược đồ hỗ trợ lưu trữ trạng thái giỏ hàng theo phiên hoặc người dùng. Trong phiên bản hiện tại, nhằm tối ưu hóa độ trễ I/O cơ sở dữ liệu và tăng tốc độ phản hồi cho các thao tác thêm/sửa giỏ hàng, hệ thống lưu trữ giỏ hàng trong PHP Session (`$_SESSION['cart']`); hai bảng này được định nghĩa sẵn trong cấu trúc CSDL nhằm phục vụ khả năng mở rộng lưu trữ giỏ hàng đồng bộ đa thiết bị (Persistent Multi-Device Cart) trong tương lai.</w:t>
       </w:r>
     </w:p>
     <w:p>
@@ -8706,7 +8758,98 @@
           <w:rFonts w:ascii="Times New Roman" w:hAnsi="Times New Roman"/>
           <w:sz w:val="26"/>
         </w:rPr>
-        <w:t>Quá trình kiểm thử được thực hiện theo phương pháp kiểm thử chức năng (Functional Testing) kết hợp kiểm thử tích hợp (Integration Testing) và kiểm thử đơn vị (Unit Testing) tự động:</w:t>
+        <w:t>Để đảm bảo chất lượng phần mềm và độ tin cậy của toàn bộ các luồng nghiệp vụ, đồ án áp dụng chiến lược kiểm thử đa tầng kết hợp giữa kiểm thử tự động hóa mã nguồn và kiểm thử chấp nhận chức năng tổng thể:</w:t>
+      </w:r>
+    </w:p>
+    <w:p>
+      <w:pPr>
+        <w:jc w:val="both"/>
+        <w:spacing w:line="360" w:lineRule="auto" w:after="100"/>
+      </w:pPr>
+      <w:r>
+        <w:rPr>
+          <w:rFonts w:ascii="Times New Roman" w:hAnsi="Times New Roman"/>
+          <w:sz w:val="26"/>
+        </w:rPr>
+        <w:t>1. **Bộ kiểm thử tự động hóa mã nguồn (Automated Test Suite):** Hệ thống xây dựng 20 ca kiểm thử đơn vị và tích hợp tự động (`tests/run_tests.php`) chạy độc lập qua CLI và được tích hợp trong pipeline GitHub Actions CI/CD. Bộ kiểm thử bao gồm 5 nhóm kiểm thử chuyên biệt:</w:t>
+      </w:r>
+    </w:p>
+    <w:p>
+      <w:pPr>
+        <w:ind w:left="400"/>
+        <w:spacing w:before="40" w:after="40"/>
+      </w:pPr>
+      <w:r>
+        <w:rPr>
+          <w:rFonts w:ascii="Times New Roman" w:hAnsi="Times New Roman"/>
+          <w:sz w:val="24"/>
+        </w:rPr>
+        <w:t>• `CartTest.php` (5 test cases): Kiểm thử toàn diện logic giỏ hàng (thêm sản phẩm, cập nhật số lượng, xóa khỏi giỏ, áp dụng mã giảm giá hợp lệ, từ chối mã giảm giá hết hạn hoặc đã đạt giới hạn sử dụng `used_count &gt;= usage_limit`).</w:t>
+      </w:r>
+    </w:p>
+    <w:p>
+      <w:pPr>
+        <w:ind w:left="400"/>
+        <w:spacing w:before="40" w:after="40"/>
+      </w:pPr>
+      <w:r>
+        <w:rPr>
+          <w:rFonts w:ascii="Times New Roman" w:hAnsi="Times New Roman"/>
+          <w:sz w:val="24"/>
+        </w:rPr>
+        <w:t>• `OrderTest.php` (4 test cases): Kiểm thử tính toàn vẹn của giao dịch đặt hàng (transaction tạo đơn thành công, trừ tồn kho an toàn `WHERE stock &gt;= ?`, tự động rollback bảo toàn dữ liệu khi tồn kho không đủ, chuyển đổi trạng thái đơn hàng).</w:t>
+      </w:r>
+    </w:p>
+    <w:p>
+      <w:pPr>
+        <w:ind w:left="400"/>
+        <w:spacing w:before="40" w:after="40"/>
+      </w:pPr>
+      <w:r>
+        <w:rPr>
+          <w:rFonts w:ascii="Times New Roman" w:hAnsi="Times New Roman"/>
+          <w:sz w:val="24"/>
+        </w:rPr>
+        <w:t>• `ProductTest.php` (5 test cases): Kiểm thử truy vấn và phân quyền đánh giá (lấy danh sách phân trang, lọc theo danh mục &amp; thương hiệu, lọc theo khoảng giá, xác thực tồn kho, kiểm tra điều kiện chỉ khách hàng đã hoàn thành mua hàng mới được phép gửi đánh giá `hasPurchased`).</w:t>
+      </w:r>
+    </w:p>
+    <w:p>
+      <w:pPr>
+        <w:ind w:left="400"/>
+        <w:spacing w:before="40" w:after="40"/>
+      </w:pPr>
+      <w:r>
+        <w:rPr>
+          <w:rFonts w:ascii="Times New Roman" w:hAnsi="Times New Roman"/>
+          <w:sz w:val="24"/>
+        </w:rPr>
+        <w:t>• `AuthTest.php` (3 test cases): Kiểm thử xác thực và an toàn mật khẩu (băm mật khẩu bằng Bcrypt `password_hash`, xác thực đăng nhập thành công với thông tin chính xác, từ chối đăng nhập khi sai mật khẩu).</w:t>
+      </w:r>
+    </w:p>
+    <w:p>
+      <w:pPr>
+        <w:ind w:left="400"/>
+        <w:spacing w:before="40" w:after="40"/>
+      </w:pPr>
+      <w:r>
+        <w:rPr>
+          <w:rFonts w:ascii="Times New Roman" w:hAnsi="Times New Roman"/>
+          <w:sz w:val="24"/>
+        </w:rPr>
+        <w:t>• `RustEngineClientTest.php` (3 test cases): Kiểm thử tính sẵn sàng và khả năng chịu lỗi (kiểm tra trạng thái kết nối `isAvailable`, tự động chuyển mạch sang tìm kiếm dự phòng khi Rust Engine ngoại tuyến, chuyển mạch sang gợi ý tương đồng dự phòng khi Rust Engine ngoại tuyến).</w:t>
+      </w:r>
+    </w:p>
+    <w:p>
+      <w:pPr>
+        <w:jc w:val="both"/>
+        <w:spacing w:line="360" w:lineRule="auto" w:after="100"/>
+      </w:pPr>
+      <w:r>
+        <w:rPr>
+          <w:rFonts w:ascii="Times New Roman" w:hAnsi="Times New Roman"/>
+          <w:sz w:val="26"/>
+        </w:rPr>
+        <w:t>2. **Ma trận kiểm thử chức năng tổng thể (End-to-End Acceptance Test Matrix):** Kiểm thử luồng tương tác thực tế của người dùng trên giao diện và đối soát dữ liệu với cơ sở dữ liệu:</w:t>
       </w:r>
     </w:p>
     <w:tbl>
@@ -9218,7 +9361,7 @@
                 <w:rFonts w:ascii="Times New Roman" w:hAnsi="Times New Roman"/>
                 <w:sz w:val="22"/>
               </w:rPr>
-              <w:t>Đăng nhập thành công, tạo session</w:t>
+              <w:t>Đăng nhập thành công, tạo session mới chống fixation</w:t>
             </w:r>
           </w:p>
         </w:tc>
@@ -10135,7 +10278,7 @@
                 <w:rFonts w:ascii="Times New Roman" w:hAnsi="Times New Roman"/>
                 <w:sz w:val="22"/>
               </w:rPr>
-              <w:t>Sản phẩm còn tồn kho</w:t>
+              <w:t>Sản phẩm còn tồn kho, kèm CSRF token</w:t>
             </w:r>
           </w:p>
         </w:tc>
@@ -11433,7 +11576,7 @@
                 <w:rFonts w:ascii="Times New Roman" w:hAnsi="Times New Roman"/>
                 <w:sz w:val="22"/>
               </w:rPr>
-              <w:t>Độ bền</w:t>
+              <w:t>Chịu lỗi</w:t>
             </w:r>
           </w:p>
         </w:tc>
@@ -11533,7 +11676,7 @@
           <w:rFonts w:ascii="Times New Roman" w:hAnsi="Times New Roman"/>
           <w:sz w:val="26"/>
         </w:rPr>
-        <w:t>*Toàn bộ 20/20 Test Cases đều đạt kết quả mong đợi.*</w:t>
+        <w:t>*Toàn bộ 20/20 Test Cases chức năng và 20/20 ca kiểm thử tự động hóa đều đạt kết quả mong đợi (100% Pass).*</w:t>
       </w:r>
     </w:p>
     <w:p>
@@ -11548,20 +11691,408 @@
           <w:color w:val="1E3A8A"/>
           <w:sz w:val="32"/>
         </w:rPr>
-        <w:t>4.5. Đánh giá và so sánh thực nghiệm hiệu năng (Benchmark PHP vs Rust Engine)</w:t>
-      </w:r>
-    </w:p>
-    <w:p>
-      <w:pPr>
-        <w:jc w:val="both"/>
-        <w:spacing w:line="360" w:lineRule="auto" w:after="100"/>
-      </w:pPr>
-      <w:r>
-        <w:rPr>
-          <w:rFonts w:ascii="Times New Roman" w:hAnsi="Times New Roman"/>
-          <w:sz w:val="26"/>
-        </w:rPr>
-        <w:t>Thực nghiệm đo lường hiệu năng được tiến hành với tập dữ liệu 1.000 bản ghi sản phẩm điện tử có đầy đủ thông số kỹ thuật phức tạp, thực hiện 500 lượt truy vấn lặp lại:</w:t>
+        <w:t>4.5. Đánh giá và so sánh thực nghiệm hiệu năng (Benchmark PHP Fallback vs Rust Engine)</w:t>
+      </w:r>
+    </w:p>
+    <w:p>
+      <w:pPr>
+        <w:pStyle w:val="Heading2"/>
+        <w:spacing w:before="200" w:after="80"/>
+      </w:pPr>
+      <w:r>
+        <w:rPr>
+          <w:rFonts w:ascii="Times New Roman" w:hAnsi="Times New Roman"/>
+          <w:b/>
+          <w:color w:val="2563EB"/>
+          <w:sz w:val="26"/>
+        </w:rPr>
+        <w:t>4.5.1. Phương pháp luận và kịch bản thực nghiệm</w:t>
+      </w:r>
+    </w:p>
+    <w:p>
+      <w:pPr>
+        <w:jc w:val="both"/>
+        <w:spacing w:line="360" w:lineRule="auto" w:after="100"/>
+      </w:pPr>
+      <w:r>
+        <w:rPr>
+          <w:rFonts w:ascii="Times New Roman" w:hAnsi="Times New Roman"/>
+          <w:sz w:val="26"/>
+        </w:rPr>
+        <w:t>Để đánh giá khách quan và minh bạch sự chênh lệch hiệu năng giữa việc xử lý tính toán cục bộ bằng PHP thuần (PHP Fallback Engine) và việc ủy nhiệm tác vụ cho dịch vụ chuyên biệt (Rust High-Performance Engine), đồ án xây dựng kịch bản đo lường thực nghiệm độc lập thông qua script `scripts/benchmark.php`.</w:t>
+      </w:r>
+    </w:p>
+    <w:p>
+      <w:pPr>
+        <w:jc w:val="both"/>
+        <w:spacing w:line="360" w:lineRule="auto" w:after="100"/>
+      </w:pPr>
+      <w:r>
+        <w:rPr>
+          <w:rFonts w:ascii="Times New Roman" w:hAnsi="Times New Roman"/>
+          <w:sz w:val="26"/>
+        </w:rPr>
+        <w:t>Kịch bản thực nghiệm được thiết kế theo hai cấp độ:</w:t>
+      </w:r>
+    </w:p>
+    <w:p>
+      <w:pPr>
+        <w:jc w:val="both"/>
+        <w:spacing w:line="360" w:lineRule="auto" w:after="100"/>
+      </w:pPr>
+      <w:r>
+        <w:rPr>
+          <w:rFonts w:ascii="Times New Roman" w:hAnsi="Times New Roman"/>
+          <w:sz w:val="26"/>
+        </w:rPr>
+        <w:t>1. **Đo lường thuật toán vi mô (In-Memory Algorithmic Micro-Benchmark):** Đo lường trực tiếp thời gian CPU xử lý các phép toán tổ hợp, ma trận và khoảng cách chuỗi trên cùng một tập dữ liệu đầu vào (từ 50 đến 1.000 bản ghi thông số kỹ thuật thiết bị điện tử) với số lần lặp lại từ 200 đến 500 lần để tính giá trị trung bình.</w:t>
+      </w:r>
+    </w:p>
+    <w:p>
+      <w:pPr>
+        <w:jc w:val="both"/>
+        <w:spacing w:line="360" w:lineRule="auto" w:after="100"/>
+      </w:pPr>
+      <w:r>
+        <w:rPr>
+          <w:rFonts w:ascii="Times New Roman" w:hAnsi="Times New Roman"/>
+          <w:sz w:val="26"/>
+        </w:rPr>
+        <w:t>2. **Phân tích độ trễ luồng yêu cầu Web tổng thể (End-to-End Request Latency Breakdown):** Phân tích chi tiết các thành phần đóng góp vào tổng thời gian phản hồi của một yêu cầu HTTP thực tế đến người dùng.</w:t>
+      </w:r>
+    </w:p>
+    <w:p>
+      <w:pPr>
+        <w:pStyle w:val="Heading2"/>
+        <w:spacing w:before="200" w:after="80"/>
+      </w:pPr>
+      <w:r>
+        <w:rPr>
+          <w:rFonts w:ascii="Times New Roman" w:hAnsi="Times New Roman"/>
+          <w:b/>
+          <w:color w:val="2563EB"/>
+          <w:sz w:val="26"/>
+        </w:rPr>
+        <w:t>4.5.2. Kết quả đo lường vi mô các thuật toán cốt lõi</w:t>
+      </w:r>
+    </w:p>
+    <w:p>
+      <w:pPr>
+        <w:jc w:val="both"/>
+        <w:spacing w:line="360" w:lineRule="auto" w:after="100"/>
+      </w:pPr>
+      <w:r>
+        <w:rPr>
+          <w:rFonts w:ascii="Times New Roman" w:hAnsi="Times New Roman"/>
+          <w:sz w:val="26"/>
+        </w:rPr>
+        <w:t>Dữ liệu đo lường thực nghiệm từ script `scripts/benchmark.php` cho thấy sự phân hóa rõ rệt về đặc tính tính toán:</w:t>
+      </w:r>
+    </w:p>
+    <w:p>
+      <w:pPr>
+        <w:ind w:left="400"/>
+        <w:spacing w:before="40" w:after="40"/>
+      </w:pPr>
+      <w:r>
+        <w:rPr>
+          <w:rFonts w:ascii="Times New Roman" w:hAnsi="Times New Roman"/>
+          <w:sz w:val="24"/>
+        </w:rPr>
+        <w:t>• **Thuật toán tìm kiếm xấp xỉ chuỗi (Fuzzy Search - Levenshtein &amp; Token Matching):**</w:t>
+      </w:r>
+    </w:p>
+    <w:p>
+      <w:pPr>
+        <w:ind w:left="400"/>
+        <w:spacing w:before="40" w:after="40"/>
+      </w:pPr>
+      <w:r>
+        <w:rPr>
+          <w:rFonts w:ascii="Times New Roman" w:hAnsi="Times New Roman"/>
+          <w:sz w:val="24"/>
+        </w:rPr>
+        <w:t>• *Dịch vụ Rust Engine:* Do được biên dịch trực tiếp ra mã máy nhị phân bản địa (Native Machine Code) và tối ưu hóa cấp độ con trỏ mảng không có chi phí Garbage Collection, Rust hoàn tất việc đối sánh từ khóa và tính khoảng cách sửa đổi Levenshtein cho danh mục sản phẩm trong thời gian dưới mili-giây (~0.5 - 2.0 ms tùy kích thước tập dữ liệu).</w:t>
+      </w:r>
+    </w:p>
+    <w:p>
+      <w:pPr>
+        <w:ind w:left="400"/>
+        <w:spacing w:before="40" w:after="40"/>
+      </w:pPr>
+      <w:r>
+        <w:rPr>
+          <w:rFonts w:ascii="Times New Roman" w:hAnsi="Times New Roman"/>
+          <w:sz w:val="24"/>
+        </w:rPr>
+        <w:t>• *PHP Fallback:* PHP xử lý theo mô hình thông dịch kịch bản; việc lặp qua các mảng liên kết lồng nhau và tính toán `levenshtein()` tốn trung bình ~10 - 25 ms.</w:t>
+      </w:r>
+    </w:p>
+    <w:p>
+      <w:pPr>
+        <w:ind w:left="400"/>
+        <w:spacing w:before="40" w:after="40"/>
+      </w:pPr>
+      <w:r>
+        <w:rPr>
+          <w:rFonts w:ascii="Times New Roman" w:hAnsi="Times New Roman"/>
+          <w:sz w:val="24"/>
+        </w:rPr>
+        <w:t>• **Tính toán ma trận độ tương đồng Cosine (Cosine Similarity Vector Space):**</w:t>
+      </w:r>
+    </w:p>
+    <w:p>
+      <w:pPr>
+        <w:ind w:left="400"/>
+        <w:spacing w:before="40" w:after="40"/>
+      </w:pPr>
+      <w:r>
+        <w:rPr>
+          <w:rFonts w:ascii="Times New Roman" w:hAnsi="Times New Roman"/>
+          <w:sz w:val="24"/>
+        </w:rPr>
+        <w:t>• *Dịch vụ Rust Engine:* Các phép nhân vô hướng vector và chuẩn hóa độ dài vector $\vec{A} \cdot \vec{B} / (\|\vec{A}\| \|\vec{B}\|)$ được trình biên dịch `rustc` tự động vector hóa (tận dụng chỉ lệnh SIMD của CPU trong bản build release). Thời gian tìm top 4 sản phẩm tương đồng nhất trong toàn bộ danh mục chỉ mất khoảng ~0.8 - 1.5 ms.</w:t>
+      </w:r>
+    </w:p>
+    <w:p>
+      <w:pPr>
+        <w:ind w:left="400"/>
+        <w:spacing w:before="40" w:after="40"/>
+      </w:pPr>
+      <w:r>
+        <w:rPr>
+          <w:rFonts w:ascii="Times New Roman" w:hAnsi="Times New Roman"/>
+          <w:sz w:val="24"/>
+        </w:rPr>
+        <w:t>• *PHP Fallback:* Cần thực hiện các vòng lặp `foreach` trên các mảng thuộc tính đặc trưng, đạt độ trễ ~15 - 30 ms.</w:t>
+      </w:r>
+    </w:p>
+    <w:p>
+      <w:pPr>
+        <w:ind w:left="400"/>
+        <w:spacing w:before="40" w:after="40"/>
+      </w:pPr>
+      <w:r>
+        <w:rPr>
+          <w:rFonts w:ascii="Times New Roman" w:hAnsi="Times New Roman"/>
+          <w:sz w:val="24"/>
+        </w:rPr>
+        <w:t>• **Phân tích dữ liệu kinh doanh (Hồi quy tuyến tính &amp; Phân loại Pareto ABC):**</w:t>
+      </w:r>
+    </w:p>
+    <w:p>
+      <w:pPr>
+        <w:ind w:left="400"/>
+        <w:spacing w:before="40" w:after="40"/>
+      </w:pPr>
+      <w:r>
+        <w:rPr>
+          <w:rFonts w:ascii="Times New Roman" w:hAnsi="Times New Roman"/>
+          <w:sz w:val="24"/>
+        </w:rPr>
+        <w:t>• *Dịch vụ Rust Engine:* Thuật toán sắp xếp O(N log N) để tính tỷ trọng doanh thu tích lũy và công thức bình phương tối thiểu O(N) hoàn tất tức thì trong khoảng ~0.5 - 1.2 ms.</w:t>
+      </w:r>
+    </w:p>
+    <w:p>
+      <w:pPr>
+        <w:ind w:left="400"/>
+        <w:spacing w:before="40" w:after="40"/>
+      </w:pPr>
+      <w:r>
+        <w:rPr>
+          <w:rFonts w:ascii="Times New Roman" w:hAnsi="Times New Roman"/>
+          <w:sz w:val="24"/>
+        </w:rPr>
+        <w:t>• *PHP Fallback:* Hoàn tất trong khoảng ~8 - 18 ms.</w:t>
+      </w:r>
+    </w:p>
+    <w:p>
+      <w:pPr>
+        <w:pStyle w:val="Heading2"/>
+        <w:spacing w:before="200" w:after="80"/>
+      </w:pPr>
+      <w:r>
+        <w:rPr>
+          <w:rFonts w:ascii="Times New Roman" w:hAnsi="Times New Roman"/>
+          <w:b/>
+          <w:color w:val="2563EB"/>
+          <w:sz w:val="26"/>
+        </w:rPr>
+        <w:t>4.5.3. Phân tích phân rã độ trễ yêu cầu Web thực tế (End-to-End Latency Breakdown)</w:t>
+      </w:r>
+    </w:p>
+    <w:p>
+      <w:pPr>
+        <w:jc w:val="both"/>
+        <w:spacing w:line="360" w:lineRule="auto" w:after="100"/>
+      </w:pPr>
+      <w:r>
+        <w:rPr>
+          <w:rFonts w:ascii="Times New Roman" w:hAnsi="Times New Roman"/>
+          <w:sz w:val="26"/>
+        </w:rPr>
+        <w:t>Trong môi trường thực tế của một website thương mại điện tử, tổng thời gian phản hồi (Client Response Time) từ góc nhìn của trình duyệt người dùng được cấu thành từ nhiều giai đoạn:</w:t>
+      </w:r>
+    </w:p>
+    <w:p>
+      <w:pPr>
+        <w:jc w:val="both"/>
+        <w:spacing w:line="360" w:lineRule="auto" w:after="100"/>
+      </w:pPr>
+      <w:r>
+        <w:rPr>
+          <w:rFonts w:ascii="Times New Roman" w:hAnsi="Times New Roman"/>
+          <w:sz w:val="26"/>
+        </w:rPr>
+        <w:t>1. **Truy vấn cơ sở dữ liệu (Database Query Latency - MySQL/SQLite):** ~5 - 15 ms cho việc truy vấn lấy danh sách sản phẩm và thông số kỹ thuật qua PDO Prepared Statements.</w:t>
+      </w:r>
+    </w:p>
+    <w:p>
+      <w:pPr>
+        <w:jc w:val="both"/>
+        <w:spacing w:line="360" w:lineRule="auto" w:after="100"/>
+      </w:pPr>
+      <w:r>
+        <w:rPr>
+          <w:rFonts w:ascii="Times New Roman" w:hAnsi="Times New Roman"/>
+          <w:sz w:val="26"/>
+        </w:rPr>
+        <w:t>2. **Giao tiếp liên tiến trình qua mạng nội bộ (Loopback IPC Overhead):** ~0.5 - 2 ms cho việc đóng gói JSON trong PHP qua `curl`, truyền qua giao diện Loopback `127.0.0.1:5000` và giải tuần tự hóa JSON trong Rust (`serde_json`).</w:t>
+      </w:r>
+    </w:p>
+    <w:p>
+      <w:pPr>
+        <w:jc w:val="both"/>
+        <w:spacing w:line="360" w:lineRule="auto" w:after="100"/>
+      </w:pPr>
+      <w:r>
+        <w:rPr>
+          <w:rFonts w:ascii="Times New Roman" w:hAnsi="Times New Roman"/>
+          <w:sz w:val="26"/>
+        </w:rPr>
+        <w:t>3. **Thời gian tính toán lõi của Rust Engine:** ~0.5 - 2 ms.</w:t>
+      </w:r>
+    </w:p>
+    <w:p>
+      <w:pPr>
+        <w:jc w:val="both"/>
+        <w:spacing w:line="360" w:lineRule="auto" w:after="100"/>
+      </w:pPr>
+      <w:r>
+        <w:rPr>
+          <w:rFonts w:ascii="Times New Roman" w:hAnsi="Times New Roman"/>
+          <w:sz w:val="26"/>
+        </w:rPr>
+        <w:t>4. **Dựng giao diện và xuất mã HTML (PHP View Rendering):** ~3 - 8 ms.</w:t>
+      </w:r>
+    </w:p>
+    <w:p>
+      <w:pPr>
+        <w:jc w:val="both"/>
+        <w:spacing w:line="360" w:lineRule="auto" w:after="100"/>
+      </w:pPr>
+      <w:r>
+        <w:rPr>
+          <w:rFonts w:ascii="Times New Roman" w:hAnsi="Times New Roman"/>
+          <w:sz w:val="26"/>
+        </w:rPr>
+        <w:t>Như vậy, tổng thời gian xử lý một yêu cầu web tìm kiếm hay gợi ý thông minh dao động trong khoảng lý tưởng từ **10 ms đến 30 ms**. Việc đưa Rust vào xử lý tính toán không nhằm triệt tiêu hoàn toàn độ trễ mạng hay độ trễ CSDL, mà giữ vai trò then chốt trong việc:</w:t>
+      </w:r>
+    </w:p>
+    <w:p>
+      <w:pPr>
+        <w:ind w:left="400"/>
+        <w:spacing w:before="40" w:after="40"/>
+      </w:pPr>
+      <w:r>
+        <w:rPr>
+          <w:rFonts w:ascii="Times New Roman" w:hAnsi="Times New Roman"/>
+          <w:sz w:val="24"/>
+        </w:rPr>
+        <w:t>• Giải phóng tiến trình Web PHP khỏi các vòng lặp tính toán nặng CPU, giúp PHP Web Server duy trì khả năng tiếp nhận các kết nối khác.</w:t>
+      </w:r>
+    </w:p>
+    <w:p>
+      <w:pPr>
+        <w:ind w:left="400"/>
+        <w:spacing w:before="40" w:after="40"/>
+      </w:pPr>
+      <w:r>
+        <w:rPr>
+          <w:rFonts w:ascii="Times New Roman" w:hAnsi="Times New Roman"/>
+          <w:sz w:val="24"/>
+        </w:rPr>
+        <w:t>• Đảm bảo độ trễ tính toán không bị bùng nổ theo cấp số nhân khi số lượng thuộc tính và sản phẩm tăng lên hàng nghìn bản ghi.</w:t>
+      </w:r>
+    </w:p>
+    <w:p>
+      <w:pPr>
+        <w:ind w:left="400"/>
+        <w:spacing w:before="40" w:after="40"/>
+      </w:pPr>
+      <w:r>
+        <w:rPr>
+          <w:rFonts w:ascii="Times New Roman" w:hAnsi="Times New Roman"/>
+          <w:sz w:val="24"/>
+        </w:rPr>
+        <w:t>• Giữ mức tiêu thụ bộ nhớ RAM của dịch vụ Rust cực kỳ khiêm tốn (~5 - 10 MB RAM), độc lập hoàn toàn với vòng đời của các tiến trình PHP.</w:t>
+      </w:r>
+    </w:p>
+    <w:p>
+      <w:pPr>
+        <w:jc w:val="both"/>
+        <w:spacing w:line="360" w:lineRule="auto" w:after="100"/>
+      </w:pPr>
+      <w:r>
+        <w:rPr>
+          <w:rFonts w:ascii="Times New Roman" w:hAnsi="Times New Roman"/>
+          <w:sz w:val="26"/>
+        </w:rPr>
+        <w:t>---</w:t>
+      </w:r>
+    </w:p>
+    <w:p>
+      <w:pPr>
+        <w:pStyle w:val="Title"/>
+        <w:jc w:val="center"/>
+        <w:spacing w:before="240" w:after="240"/>
+      </w:pPr>
+      <w:r>
+        <w:rPr>
+          <w:rFonts w:ascii="Times New Roman" w:hAnsi="Times New Roman"/>
+          <w:b/>
+          <w:color w:val="0F172A"/>
+          <w:sz w:val="40"/>
+        </w:rPr>
+        <w:t>CHƯƠNG 5: ĐÁNH GIÁ, KẾT LUẬN VÀ HƯỚNG PHÁT TRIỂN</w:t>
+      </w:r>
+    </w:p>
+    <w:p>
+      <w:pPr>
+        <w:pStyle w:val="Heading1"/>
+        <w:spacing w:before="300" w:after="120"/>
+      </w:pPr>
+      <w:r>
+        <w:rPr>
+          <w:rFonts w:ascii="Times New Roman" w:hAnsi="Times New Roman"/>
+          <w:b/>
+          <w:color w:val="1E3A8A"/>
+          <w:sz w:val="32"/>
+        </w:rPr>
+        <w:t>5.1. Đánh giá kết quả đạt được đối chiếu với mục tiêu ban đầu</w:t>
+      </w:r>
+    </w:p>
+    <w:p>
+      <w:pPr>
+        <w:jc w:val="both"/>
+        <w:spacing w:line="360" w:lineRule="auto" w:after="100"/>
+      </w:pPr>
+      <w:r>
+        <w:rPr>
+          <w:rFonts w:ascii="Times New Roman" w:hAnsi="Times New Roman"/>
+          <w:sz w:val="26"/>
+        </w:rPr>
+        <w:t>Đối chiếu với các mục tiêu đề ra tại Chương 1, đồ án đã hoàn thành đầy đủ các yêu cầu kỹ thuật và nghiệp vụ trọng tâm:</w:t>
       </w:r>
     </w:p>
     <w:tbl>
@@ -11587,70 +12118,49 @@
                 <w:rFonts w:ascii="Times New Roman" w:hAnsi="Times New Roman"/>
                 <w:sz w:val="22"/>
               </w:rPr>
-              <w:t>Chỉ số đo lường</w:t>
-            </w:r>
-          </w:p>
-        </w:tc>
-        <w:tc>
-          <w:tcPr>
-            <w:tcW w:w="2400" w:type="dxa"/>
-            <w:tcBorders>
-              <w:top w:val="single" w:sz="4" w:space="0" w:color="CCCCCC"/>
-              <w:bottom w:val="single" w:sz="4" w:space="0" w:color="CCCCCC"/>
-            </w:tcBorders>
-          </w:tcPr>
-          <w:p>
-            <w:pPr>
-              <w:spacing w:before="60" w:after="60"/>
-            </w:pPr>
-            <w:r>
-              <w:rPr>
-                <w:rFonts w:ascii="Times New Roman" w:hAnsi="Times New Roman"/>
-                <w:sz w:val="22"/>
-              </w:rPr>
-              <w:t>Thuật toán PHP Thuần</w:t>
-            </w:r>
-          </w:p>
-        </w:tc>
-        <w:tc>
-          <w:tcPr>
-            <w:tcW w:w="2400" w:type="dxa"/>
-            <w:tcBorders>
-              <w:top w:val="single" w:sz="4" w:space="0" w:color="CCCCCC"/>
-              <w:bottom w:val="single" w:sz="4" w:space="0" w:color="CCCCCC"/>
-            </w:tcBorders>
-          </w:tcPr>
-          <w:p>
-            <w:pPr>
-              <w:spacing w:before="60" w:after="60"/>
-            </w:pPr>
-            <w:r>
-              <w:rPr>
-                <w:rFonts w:ascii="Times New Roman" w:hAnsi="Times New Roman"/>
-                <w:sz w:val="22"/>
-              </w:rPr>
-              <w:t>Dịch vụ Rust Engine</w:t>
-            </w:r>
-          </w:p>
-        </w:tc>
-        <w:tc>
-          <w:tcPr>
-            <w:tcW w:w="2400" w:type="dxa"/>
-            <w:tcBorders>
-              <w:top w:val="single" w:sz="4" w:space="0" w:color="CCCCCC"/>
-              <w:bottom w:val="single" w:sz="4" w:space="0" w:color="CCCCCC"/>
-            </w:tcBorders>
-          </w:tcPr>
-          <w:p>
-            <w:pPr>
-              <w:spacing w:before="60" w:after="60"/>
-            </w:pPr>
-            <w:r>
-              <w:rPr>
-                <w:rFonts w:ascii="Times New Roman" w:hAnsi="Times New Roman"/>
-                <w:sz w:val="22"/>
-              </w:rPr>
-              <w:t>Tỷ lệ cải thiện</w:t>
+              <w:t>Mục tiêu đề ra</w:t>
+            </w:r>
+          </w:p>
+        </w:tc>
+        <w:tc>
+          <w:tcPr>
+            <w:tcW w:w="2400" w:type="dxa"/>
+            <w:tcBorders>
+              <w:top w:val="single" w:sz="4" w:space="0" w:color="CCCCCC"/>
+              <w:bottom w:val="single" w:sz="4" w:space="0" w:color="CCCCCC"/>
+            </w:tcBorders>
+          </w:tcPr>
+          <w:p>
+            <w:pPr>
+              <w:spacing w:before="60" w:after="60"/>
+            </w:pPr>
+            <w:r>
+              <w:rPr>
+                <w:rFonts w:ascii="Times New Roman" w:hAnsi="Times New Roman"/>
+                <w:sz w:val="22"/>
+              </w:rPr>
+              <w:t>Mức độ hoàn thành</w:t>
+            </w:r>
+          </w:p>
+        </w:tc>
+        <w:tc>
+          <w:tcPr>
+            <w:tcW w:w="2400" w:type="dxa"/>
+            <w:tcBorders>
+              <w:top w:val="single" w:sz="4" w:space="0" w:color="CCCCCC"/>
+              <w:bottom w:val="single" w:sz="4" w:space="0" w:color="CCCCCC"/>
+            </w:tcBorders>
+          </w:tcPr>
+          <w:p>
+            <w:pPr>
+              <w:spacing w:before="60" w:after="60"/>
+            </w:pPr>
+            <w:r>
+              <w:rPr>
+                <w:rFonts w:ascii="Times New Roman" w:hAnsi="Times New Roman"/>
+                <w:sz w:val="22"/>
+              </w:rPr>
+              <w:t>Kết quả minh chứng thực tế</w:t>
             </w:r>
           </w:p>
         </w:tc>
@@ -11679,70 +12189,49 @@
                 <w:rFonts w:ascii="Times New Roman" w:hAnsi="Times New Roman"/>
                 <w:sz w:val="22"/>
               </w:rPr>
-              <w:t>**Thời gian tìm kiếm Fuzzy (Levenshtein)**</w:t>
-            </w:r>
-          </w:p>
-        </w:tc>
-        <w:tc>
-          <w:tcPr>
-            <w:tcW w:w="2400" w:type="dxa"/>
-            <w:tcBorders>
-              <w:top w:val="single" w:sz="4" w:space="0" w:color="CCCCCC"/>
-              <w:bottom w:val="single" w:sz="4" w:space="0" w:color="CCCCCC"/>
-            </w:tcBorders>
-          </w:tcPr>
-          <w:p>
-            <w:pPr>
-              <w:spacing w:before="60" w:after="60"/>
-            </w:pPr>
-            <w:r>
-              <w:rPr>
-                <w:rFonts w:ascii="Times New Roman" w:hAnsi="Times New Roman"/>
-                <w:sz w:val="22"/>
-              </w:rPr>
-              <w:t>14.8 ms</w:t>
-            </w:r>
-          </w:p>
-        </w:tc>
-        <w:tc>
-          <w:tcPr>
-            <w:tcW w:w="2400" w:type="dxa"/>
-            <w:tcBorders>
-              <w:top w:val="single" w:sz="4" w:space="0" w:color="CCCCCC"/>
-              <w:bottom w:val="single" w:sz="4" w:space="0" w:color="CCCCCC"/>
-            </w:tcBorders>
-          </w:tcPr>
-          <w:p>
-            <w:pPr>
-              <w:spacing w:before="60" w:after="60"/>
-            </w:pPr>
-            <w:r>
-              <w:rPr>
-                <w:rFonts w:ascii="Times New Roman" w:hAnsi="Times New Roman"/>
-                <w:sz w:val="22"/>
-              </w:rPr>
-              <w:t>**0.82 ms**</w:t>
-            </w:r>
-          </w:p>
-        </w:tc>
-        <w:tc>
-          <w:tcPr>
-            <w:tcW w:w="2400" w:type="dxa"/>
-            <w:tcBorders>
-              <w:top w:val="single" w:sz="4" w:space="0" w:color="CCCCCC"/>
-              <w:bottom w:val="single" w:sz="4" w:space="0" w:color="CCCCCC"/>
-            </w:tcBorders>
-          </w:tcPr>
-          <w:p>
-            <w:pPr>
-              <w:spacing w:before="60" w:after="60"/>
-            </w:pPr>
-            <w:r>
-              <w:rPr>
-                <w:rFonts w:ascii="Times New Roman" w:hAnsi="Times New Roman"/>
-                <w:sz w:val="22"/>
-              </w:rPr>
-              <w:t>**Nhanh hơn ~18 lần**</w:t>
+              <w:t>Xây dựng website TMĐT thiết bị điện tử</w:t>
+            </w:r>
+          </w:p>
+        </w:tc>
+        <w:tc>
+          <w:tcPr>
+            <w:tcW w:w="2400" w:type="dxa"/>
+            <w:tcBorders>
+              <w:top w:val="single" w:sz="4" w:space="0" w:color="CCCCCC"/>
+              <w:bottom w:val="single" w:sz="4" w:space="0" w:color="CCCCCC"/>
+            </w:tcBorders>
+          </w:tcPr>
+          <w:p>
+            <w:pPr>
+              <w:spacing w:before="60" w:after="60"/>
+            </w:pPr>
+            <w:r>
+              <w:rPr>
+                <w:rFonts w:ascii="Times New Roman" w:hAnsi="Times New Roman"/>
+                <w:sz w:val="22"/>
+              </w:rPr>
+              <w:t>**Hoàn thành tốt**</w:t>
+            </w:r>
+          </w:p>
+        </w:tc>
+        <w:tc>
+          <w:tcPr>
+            <w:tcW w:w="2400" w:type="dxa"/>
+            <w:tcBorders>
+              <w:top w:val="single" w:sz="4" w:space="0" w:color="CCCCCC"/>
+              <w:bottom w:val="single" w:sz="4" w:space="0" w:color="CCCCCC"/>
+            </w:tcBorders>
+          </w:tcPr>
+          <w:p>
+            <w:pPr>
+              <w:spacing w:before="60" w:after="60"/>
+            </w:pPr>
+            <w:r>
+              <w:rPr>
+                <w:rFonts w:ascii="Times New Roman" w:hAnsi="Times New Roman"/>
+                <w:sz w:val="22"/>
+              </w:rPr>
+              <w:t>Đầy đủ giao diện responsive, 6 ngành hàng, giỏ hàng AJAX, checkout VietQR.</w:t>
             </w:r>
           </w:p>
         </w:tc>
@@ -11771,70 +12260,49 @@
                 <w:rFonts w:ascii="Times New Roman" w:hAnsi="Times New Roman"/>
                 <w:sz w:val="22"/>
               </w:rPr>
-              <w:t>**Tính độ tương đồng Cosine (Gợi ý)**</w:t>
-            </w:r>
-          </w:p>
-        </w:tc>
-        <w:tc>
-          <w:tcPr>
-            <w:tcW w:w="2400" w:type="dxa"/>
-            <w:tcBorders>
-              <w:top w:val="single" w:sz="4" w:space="0" w:color="CCCCCC"/>
-              <w:bottom w:val="single" w:sz="4" w:space="0" w:color="CCCCCC"/>
-            </w:tcBorders>
-          </w:tcPr>
-          <w:p>
-            <w:pPr>
-              <w:spacing w:before="60" w:after="60"/>
-            </w:pPr>
-            <w:r>
-              <w:rPr>
-                <w:rFonts w:ascii="Times New Roman" w:hAnsi="Times New Roman"/>
-                <w:sz w:val="22"/>
-              </w:rPr>
-              <w:t>22.4 ms</w:t>
-            </w:r>
-          </w:p>
-        </w:tc>
-        <w:tc>
-          <w:tcPr>
-            <w:tcW w:w="2400" w:type="dxa"/>
-            <w:tcBorders>
-              <w:top w:val="single" w:sz="4" w:space="0" w:color="CCCCCC"/>
-              <w:bottom w:val="single" w:sz="4" w:space="0" w:color="CCCCCC"/>
-            </w:tcBorders>
-          </w:tcPr>
-          <w:p>
-            <w:pPr>
-              <w:spacing w:before="60" w:after="60"/>
-            </w:pPr>
-            <w:r>
-              <w:rPr>
-                <w:rFonts w:ascii="Times New Roman" w:hAnsi="Times New Roman"/>
-                <w:sz w:val="22"/>
-              </w:rPr>
-              <w:t>**1.15 ms**</w:t>
-            </w:r>
-          </w:p>
-        </w:tc>
-        <w:tc>
-          <w:tcPr>
-            <w:tcW w:w="2400" w:type="dxa"/>
-            <w:tcBorders>
-              <w:top w:val="single" w:sz="4" w:space="0" w:color="CCCCCC"/>
-              <w:bottom w:val="single" w:sz="4" w:space="0" w:color="CCCCCC"/>
-            </w:tcBorders>
-          </w:tcPr>
-          <w:p>
-            <w:pPr>
-              <w:spacing w:before="60" w:after="60"/>
-            </w:pPr>
-            <w:r>
-              <w:rPr>
-                <w:rFonts w:ascii="Times New Roman" w:hAnsi="Times New Roman"/>
-                <w:sz w:val="22"/>
-              </w:rPr>
-              <w:t>**Nhanh hơn ~19.5 lần**</w:t>
+              <w:t>Kiến trúc Hybrid PHP kết hợp Rust Engine</w:t>
+            </w:r>
+          </w:p>
+        </w:tc>
+        <w:tc>
+          <w:tcPr>
+            <w:tcW w:w="2400" w:type="dxa"/>
+            <w:tcBorders>
+              <w:top w:val="single" w:sz="4" w:space="0" w:color="CCCCCC"/>
+              <w:bottom w:val="single" w:sz="4" w:space="0" w:color="CCCCCC"/>
+            </w:tcBorders>
+          </w:tcPr>
+          <w:p>
+            <w:pPr>
+              <w:spacing w:before="60" w:after="60"/>
+            </w:pPr>
+            <w:r>
+              <w:rPr>
+                <w:rFonts w:ascii="Times New Roman" w:hAnsi="Times New Roman"/>
+                <w:sz w:val="22"/>
+              </w:rPr>
+              <w:t>**Hoàn thành tốt**</w:t>
+            </w:r>
+          </w:p>
+        </w:tc>
+        <w:tc>
+          <w:tcPr>
+            <w:tcW w:w="2400" w:type="dxa"/>
+            <w:tcBorders>
+              <w:top w:val="single" w:sz="4" w:space="0" w:color="CCCCCC"/>
+              <w:bottom w:val="single" w:sz="4" w:space="0" w:color="CCCCCC"/>
+            </w:tcBorders>
+          </w:tcPr>
+          <w:p>
+            <w:pPr>
+              <w:spacing w:before="60" w:after="60"/>
+            </w:pPr>
+            <w:r>
+              <w:rPr>
+                <w:rFonts w:ascii="Times New Roman" w:hAnsi="Times New Roman"/>
+                <w:sz w:val="22"/>
+              </w:rPr>
+              <w:t>Dịch vụ Rust độc lập xử lý tìm kiếm, gợi ý, phân tích; giao tiếp qua REST API.</w:t>
             </w:r>
           </w:p>
         </w:tc>
@@ -11863,70 +12331,49 @@
                 <w:rFonts w:ascii="Times New Roman" w:hAnsi="Times New Roman"/>
                 <w:sz w:val="22"/>
               </w:rPr>
-              <w:t>**Dự báo Hồi quy &amp; Phân tích ABC**</w:t>
-            </w:r>
-          </w:p>
-        </w:tc>
-        <w:tc>
-          <w:tcPr>
-            <w:tcW w:w="2400" w:type="dxa"/>
-            <w:tcBorders>
-              <w:top w:val="single" w:sz="4" w:space="0" w:color="CCCCCC"/>
-              <w:bottom w:val="single" w:sz="4" w:space="0" w:color="CCCCCC"/>
-            </w:tcBorders>
-          </w:tcPr>
-          <w:p>
-            <w:pPr>
-              <w:spacing w:before="60" w:after="60"/>
-            </w:pPr>
-            <w:r>
-              <w:rPr>
-                <w:rFonts w:ascii="Times New Roman" w:hAnsi="Times New Roman"/>
-                <w:sz w:val="22"/>
-              </w:rPr>
-              <w:t>18.6 ms</w:t>
-            </w:r>
-          </w:p>
-        </w:tc>
-        <w:tc>
-          <w:tcPr>
-            <w:tcW w:w="2400" w:type="dxa"/>
-            <w:tcBorders>
-              <w:top w:val="single" w:sz="4" w:space="0" w:color="CCCCCC"/>
-              <w:bottom w:val="single" w:sz="4" w:space="0" w:color="CCCCCC"/>
-            </w:tcBorders>
-          </w:tcPr>
-          <w:p>
-            <w:pPr>
-              <w:spacing w:before="60" w:after="60"/>
-            </w:pPr>
-            <w:r>
-              <w:rPr>
-                <w:rFonts w:ascii="Times New Roman" w:hAnsi="Times New Roman"/>
-                <w:sz w:val="22"/>
-              </w:rPr>
-              <w:t>**0.94 ms**</w:t>
-            </w:r>
-          </w:p>
-        </w:tc>
-        <w:tc>
-          <w:tcPr>
-            <w:tcW w:w="2400" w:type="dxa"/>
-            <w:tcBorders>
-              <w:top w:val="single" w:sz="4" w:space="0" w:color="CCCCCC"/>
-              <w:bottom w:val="single" w:sz="4" w:space="0" w:color="CCCCCC"/>
-            </w:tcBorders>
-          </w:tcPr>
-          <w:p>
-            <w:pPr>
-              <w:spacing w:before="60" w:after="60"/>
-            </w:pPr>
-            <w:r>
-              <w:rPr>
-                <w:rFonts w:ascii="Times New Roman" w:hAnsi="Times New Roman"/>
-                <w:sz w:val="22"/>
-              </w:rPr>
-              <w:t>**Nhanh hơn ~19.8 lần**</w:t>
+              <w:t>Cơ chế Graceful Fallback dự phòng</w:t>
+            </w:r>
+          </w:p>
+        </w:tc>
+        <w:tc>
+          <w:tcPr>
+            <w:tcW w:w="2400" w:type="dxa"/>
+            <w:tcBorders>
+              <w:top w:val="single" w:sz="4" w:space="0" w:color="CCCCCC"/>
+              <w:bottom w:val="single" w:sz="4" w:space="0" w:color="CCCCCC"/>
+            </w:tcBorders>
+          </w:tcPr>
+          <w:p>
+            <w:pPr>
+              <w:spacing w:before="60" w:after="60"/>
+            </w:pPr>
+            <w:r>
+              <w:rPr>
+                <w:rFonts w:ascii="Times New Roman" w:hAnsi="Times New Roman"/>
+                <w:sz w:val="22"/>
+              </w:rPr>
+              <w:t>**Hoàn thành tốt**</w:t>
+            </w:r>
+          </w:p>
+        </w:tc>
+        <w:tc>
+          <w:tcPr>
+            <w:tcW w:w="2400" w:type="dxa"/>
+            <w:tcBorders>
+              <w:top w:val="single" w:sz="4" w:space="0" w:color="CCCCCC"/>
+              <w:bottom w:val="single" w:sz="4" w:space="0" w:color="CCCCCC"/>
+            </w:tcBorders>
+          </w:tcPr>
+          <w:p>
+            <w:pPr>
+              <w:spacing w:before="60" w:after="60"/>
+            </w:pPr>
+            <w:r>
+              <w:rPr>
+                <w:rFonts w:ascii="Times New Roman" w:hAnsi="Times New Roman"/>
+                <w:sz w:val="22"/>
+              </w:rPr>
+              <w:t>Tự động chuyển sang thuật toán PHP nội bộ khi Rust tắt, không phát sinh lỗi.</w:t>
             </w:r>
           </w:p>
         </w:tc>
@@ -11955,70 +12402,49 @@
                 <w:rFonts w:ascii="Times New Roman" w:hAnsi="Times New Roman"/>
                 <w:sz w:val="22"/>
               </w:rPr>
-              <w:t>**Mức tiêu hao bộ nhớ RAM**</w:t>
-            </w:r>
-          </w:p>
-        </w:tc>
-        <w:tc>
-          <w:tcPr>
-            <w:tcW w:w="2400" w:type="dxa"/>
-            <w:tcBorders>
-              <w:top w:val="single" w:sz="4" w:space="0" w:color="CCCCCC"/>
-              <w:bottom w:val="single" w:sz="4" w:space="0" w:color="CCCCCC"/>
-            </w:tcBorders>
-          </w:tcPr>
-          <w:p>
-            <w:pPr>
-              <w:spacing w:before="60" w:after="60"/>
-            </w:pPr>
-            <w:r>
-              <w:rPr>
-                <w:rFonts w:ascii="Times New Roman" w:hAnsi="Times New Roman"/>
-                <w:sz w:val="22"/>
-              </w:rPr>
-              <w:t>~38 MB (PHP Process)</w:t>
-            </w:r>
-          </w:p>
-        </w:tc>
-        <w:tc>
-          <w:tcPr>
-            <w:tcW w:w="2400" w:type="dxa"/>
-            <w:tcBorders>
-              <w:top w:val="single" w:sz="4" w:space="0" w:color="CCCCCC"/>
-              <w:bottom w:val="single" w:sz="4" w:space="0" w:color="CCCCCC"/>
-            </w:tcBorders>
-          </w:tcPr>
-          <w:p>
-            <w:pPr>
-              <w:spacing w:before="60" w:after="60"/>
-            </w:pPr>
-            <w:r>
-              <w:rPr>
-                <w:rFonts w:ascii="Times New Roman" w:hAnsi="Times New Roman"/>
-                <w:sz w:val="22"/>
-              </w:rPr>
-              <w:t>**~4.2 MB (Rust Binary)**</w:t>
-            </w:r>
-          </w:p>
-        </w:tc>
-        <w:tc>
-          <w:tcPr>
-            <w:tcW w:w="2400" w:type="dxa"/>
-            <w:tcBorders>
-              <w:top w:val="single" w:sz="4" w:space="0" w:color="CCCCCC"/>
-              <w:bottom w:val="single" w:sz="4" w:space="0" w:color="CCCCCC"/>
-            </w:tcBorders>
-          </w:tcPr>
-          <w:p>
-            <w:pPr>
-              <w:spacing w:before="60" w:after="60"/>
-            </w:pPr>
-            <w:r>
-              <w:rPr>
-                <w:rFonts w:ascii="Times New Roman" w:hAnsi="Times New Roman"/>
-                <w:sz w:val="22"/>
-              </w:rPr>
-              <w:t>**Tiết kiệm ~89% RAM**</w:t>
+              <w:t>Khả năng chạy Portable trên máy trường</w:t>
+            </w:r>
+          </w:p>
+        </w:tc>
+        <w:tc>
+          <w:tcPr>
+            <w:tcW w:w="2400" w:type="dxa"/>
+            <w:tcBorders>
+              <w:top w:val="single" w:sz="4" w:space="0" w:color="CCCCCC"/>
+              <w:bottom w:val="single" w:sz="4" w:space="0" w:color="CCCCCC"/>
+            </w:tcBorders>
+          </w:tcPr>
+          <w:p>
+            <w:pPr>
+              <w:spacing w:before="60" w:after="60"/>
+            </w:pPr>
+            <w:r>
+              <w:rPr>
+                <w:rFonts w:ascii="Times New Roman" w:hAnsi="Times New Roman"/>
+                <w:sz w:val="22"/>
+              </w:rPr>
+              <w:t>**Hoàn thành tốt**</w:t>
+            </w:r>
+          </w:p>
+        </w:tc>
+        <w:tc>
+          <w:tcPr>
+            <w:tcW w:w="2400" w:type="dxa"/>
+            <w:tcBorders>
+              <w:top w:val="single" w:sz="4" w:space="0" w:color="CCCCCC"/>
+              <w:bottom w:val="single" w:sz="4" w:space="0" w:color="CCCCCC"/>
+            </w:tcBorders>
+          </w:tcPr>
+          <w:p>
+            <w:pPr>
+              <w:spacing w:before="60" w:after="60"/>
+            </w:pPr>
+            <w:r>
+              <w:rPr>
+                <w:rFonts w:ascii="Times New Roman" w:hAnsi="Times New Roman"/>
+                <w:sz w:val="22"/>
+              </w:rPr>
+              <w:t>Hỗ trợ Dual Database (MySQL + SQLite tự động); kịch bản 1-click `start.bat`.</w:t>
             </w:r>
           </w:p>
         </w:tc>
@@ -12047,211 +12473,49 @@
                 <w:rFonts w:ascii="Times New Roman" w:hAnsi="Times New Roman"/>
                 <w:sz w:val="22"/>
               </w:rPr>
-              <w:t>**Thông lượng xử lý tối đa (RPS)**</w:t>
-            </w:r>
-          </w:p>
-        </w:tc>
-        <w:tc>
-          <w:tcPr>
-            <w:tcW w:w="2400" w:type="dxa"/>
-            <w:tcBorders>
-              <w:top w:val="single" w:sz="4" w:space="0" w:color="CCCCCC"/>
-              <w:bottom w:val="single" w:sz="4" w:space="0" w:color="CCCCCC"/>
-            </w:tcBorders>
-          </w:tcPr>
-          <w:p>
-            <w:pPr>
-              <w:spacing w:before="60" w:after="60"/>
-            </w:pPr>
-            <w:r>
-              <w:rPr>
-                <w:rFonts w:ascii="Times New Roman" w:hAnsi="Times New Roman"/>
-                <w:sz w:val="22"/>
-              </w:rPr>
-              <w:t>~180 requests/sec</w:t>
-            </w:r>
-          </w:p>
-        </w:tc>
-        <w:tc>
-          <w:tcPr>
-            <w:tcW w:w="2400" w:type="dxa"/>
-            <w:tcBorders>
-              <w:top w:val="single" w:sz="4" w:space="0" w:color="CCCCCC"/>
-              <w:bottom w:val="single" w:sz="4" w:space="0" w:color="CCCCCC"/>
-            </w:tcBorders>
-          </w:tcPr>
-          <w:p>
-            <w:pPr>
-              <w:spacing w:before="60" w:after="60"/>
-            </w:pPr>
-            <w:r>
-              <w:rPr>
-                <w:rFonts w:ascii="Times New Roman" w:hAnsi="Times New Roman"/>
-                <w:sz w:val="22"/>
-              </w:rPr>
-              <w:t>**~3.400 requests/sec**</w:t>
-            </w:r>
-          </w:p>
-        </w:tc>
-        <w:tc>
-          <w:tcPr>
-            <w:tcW w:w="2400" w:type="dxa"/>
-            <w:tcBorders>
-              <w:top w:val="single" w:sz="4" w:space="0" w:color="CCCCCC"/>
-              <w:bottom w:val="single" w:sz="4" w:space="0" w:color="CCCCCC"/>
-            </w:tcBorders>
-          </w:tcPr>
-          <w:p>
-            <w:pPr>
-              <w:spacing w:before="60" w:after="60"/>
-            </w:pPr>
-            <w:r>
-              <w:rPr>
-                <w:rFonts w:ascii="Times New Roman" w:hAnsi="Times New Roman"/>
-                <w:sz w:val="22"/>
-              </w:rPr>
-              <w:t>**Cao hơn ~18.8 lần**</w:t>
-            </w:r>
-          </w:p>
-        </w:tc>
-      </w:tr>
-    </w:tbl>
-    <w:p>
-      <w:pPr>
-        <w:jc w:val="both"/>
-        <w:spacing w:line="360" w:lineRule="auto" w:after="100"/>
-      </w:pPr>
-      <w:r>
-        <w:rPr>
-          <w:rFonts w:ascii="Times New Roman" w:hAnsi="Times New Roman"/>
-          <w:sz w:val="26"/>
-        </w:rPr>
-        <w:t>Kết quả thực nghiệm chứng minh rằng kiến trúc Hybrid đem lại sự đột phá vượt trội về tốc độ xử lý và khả năng chịu tải, đồng thời giảm thiểu áp lực tài nguyên phần cứng.</w:t>
-      </w:r>
-    </w:p>
-    <w:p>
-      <w:pPr>
-        <w:jc w:val="both"/>
-        <w:spacing w:line="360" w:lineRule="auto" w:after="100"/>
-      </w:pPr>
-      <w:r>
-        <w:rPr>
-          <w:rFonts w:ascii="Times New Roman" w:hAnsi="Times New Roman"/>
-          <w:sz w:val="26"/>
-        </w:rPr>
-        <w:t>---</w:t>
-      </w:r>
-    </w:p>
-    <w:p>
-      <w:pPr>
-        <w:pStyle w:val="Title"/>
-        <w:jc w:val="center"/>
-        <w:spacing w:before="240" w:after="240"/>
-      </w:pPr>
-      <w:r>
-        <w:rPr>
-          <w:rFonts w:ascii="Times New Roman" w:hAnsi="Times New Roman"/>
-          <w:b/>
-          <w:color w:val="0F172A"/>
-          <w:sz w:val="40"/>
-        </w:rPr>
-        <w:t>CHƯƠNG 5: ĐÁNH GIÁ, KẾT LUẬN VÀ HƯỚNG PHÁT TRIỂN</w:t>
-      </w:r>
-    </w:p>
-    <w:p>
-      <w:pPr>
-        <w:pStyle w:val="Heading1"/>
-        <w:spacing w:before="300" w:after="120"/>
-      </w:pPr>
-      <w:r>
-        <w:rPr>
-          <w:rFonts w:ascii="Times New Roman" w:hAnsi="Times New Roman"/>
-          <w:b/>
-          <w:color w:val="1E3A8A"/>
-          <w:sz w:val="32"/>
-        </w:rPr>
-        <w:t>5.1. Đánh giá kết quả đạt được đối chiếu với mục tiêu ban đầu</w:t>
-      </w:r>
-    </w:p>
-    <w:p>
-      <w:pPr>
-        <w:jc w:val="both"/>
-        <w:spacing w:line="360" w:lineRule="auto" w:after="100"/>
-      </w:pPr>
-      <w:r>
-        <w:rPr>
-          <w:rFonts w:ascii="Times New Roman" w:hAnsi="Times New Roman"/>
-          <w:sz w:val="26"/>
-        </w:rPr>
-        <w:t>Đối chiếu với các mục tiêu đề ra tại Chương 1, đồ án đã hoàn thành trọn vẹn và vượt mức các yêu cầu:</w:t>
-      </w:r>
-    </w:p>
-    <w:tbl>
-      <w:tblPr>
-        <w:tblW w:w="9600" w:type="dxa"/>
-        <w:jc w:val="center"/>
-      </w:tblPr>
-      <w:tr>
-        <w:tc>
-          <w:tcPr>
-            <w:tcW w:w="2400" w:type="dxa"/>
-            <w:tcBorders>
-              <w:top w:val="single" w:sz="4" w:space="0" w:color="CCCCCC"/>
-              <w:bottom w:val="single" w:sz="4" w:space="0" w:color="CCCCCC"/>
-            </w:tcBorders>
-          </w:tcPr>
-          <w:p>
-            <w:pPr>
-              <w:spacing w:before="60" w:after="60"/>
-            </w:pPr>
-            <w:r>
-              <w:rPr>
-                <w:rFonts w:ascii="Times New Roman" w:hAnsi="Times New Roman"/>
-                <w:sz w:val="22"/>
-              </w:rPr>
-              <w:t>Mục tiêu đề ra</w:t>
-            </w:r>
-          </w:p>
-        </w:tc>
-        <w:tc>
-          <w:tcPr>
-            <w:tcW w:w="2400" w:type="dxa"/>
-            <w:tcBorders>
-              <w:top w:val="single" w:sz="4" w:space="0" w:color="CCCCCC"/>
-              <w:bottom w:val="single" w:sz="4" w:space="0" w:color="CCCCCC"/>
-            </w:tcBorders>
-          </w:tcPr>
-          <w:p>
-            <w:pPr>
-              <w:spacing w:before="60" w:after="60"/>
-            </w:pPr>
-            <w:r>
-              <w:rPr>
-                <w:rFonts w:ascii="Times New Roman" w:hAnsi="Times New Roman"/>
-                <w:sz w:val="22"/>
-              </w:rPr>
-              <w:t>Mức độ hoàn thành</w:t>
-            </w:r>
-          </w:p>
-        </w:tc>
-        <w:tc>
-          <w:tcPr>
-            <w:tcW w:w="2400" w:type="dxa"/>
-            <w:tcBorders>
-              <w:top w:val="single" w:sz="4" w:space="0" w:color="CCCCCC"/>
-              <w:bottom w:val="single" w:sz="4" w:space="0" w:color="CCCCCC"/>
-            </w:tcBorders>
-          </w:tcPr>
-          <w:p>
-            <w:pPr>
-              <w:spacing w:before="60" w:after="60"/>
-            </w:pPr>
-            <w:r>
-              <w:rPr>
-                <w:rFonts w:ascii="Times New Roman" w:hAnsi="Times New Roman"/>
-                <w:sz w:val="22"/>
-              </w:rPr>
-              <w:t>Kết quả minh chứng thực tế</w:t>
+              <w:t>Tự động hóa CI/CD với GitHub Actions</w:t>
+            </w:r>
+          </w:p>
+        </w:tc>
+        <w:tc>
+          <w:tcPr>
+            <w:tcW w:w="2400" w:type="dxa"/>
+            <w:tcBorders>
+              <w:top w:val="single" w:sz="4" w:space="0" w:color="CCCCCC"/>
+              <w:bottom w:val="single" w:sz="4" w:space="0" w:color="CCCCCC"/>
+            </w:tcBorders>
+          </w:tcPr>
+          <w:p>
+            <w:pPr>
+              <w:spacing w:before="60" w:after="60"/>
+            </w:pPr>
+            <w:r>
+              <w:rPr>
+                <w:rFonts w:ascii="Times New Roman" w:hAnsi="Times New Roman"/>
+                <w:sz w:val="22"/>
+              </w:rPr>
+              <w:t>**Hoàn thành tốt**</w:t>
+            </w:r>
+          </w:p>
+        </w:tc>
+        <w:tc>
+          <w:tcPr>
+            <w:tcW w:w="2400" w:type="dxa"/>
+            <w:tcBorders>
+              <w:top w:val="single" w:sz="4" w:space="0" w:color="CCCCCC"/>
+              <w:bottom w:val="single" w:sz="4" w:space="0" w:color="CCCCCC"/>
+            </w:tcBorders>
+          </w:tcPr>
+          <w:p>
+            <w:pPr>
+              <w:spacing w:before="60" w:after="60"/>
+            </w:pPr>
+            <w:r>
+              <w:rPr>
+                <w:rFonts w:ascii="Times New Roman" w:hAnsi="Times New Roman"/>
+                <w:sz w:val="22"/>
+              </w:rPr>
+              <w:t>Pipeline kiểm thử PHP và biên dịch chéo Rust nhị phân cho cả Windows và Linux.</w:t>
             </w:r>
           </w:p>
         </w:tc>
@@ -12280,361 +12544,6 @@
                 <w:rFonts w:ascii="Times New Roman" w:hAnsi="Times New Roman"/>
                 <w:sz w:val="22"/>
               </w:rPr>
-              <w:t>Xây dựng website TMĐT thiết bị điện tử</w:t>
-            </w:r>
-          </w:p>
-        </w:tc>
-        <w:tc>
-          <w:tcPr>
-            <w:tcW w:w="2400" w:type="dxa"/>
-            <w:tcBorders>
-              <w:top w:val="single" w:sz="4" w:space="0" w:color="CCCCCC"/>
-              <w:bottom w:val="single" w:sz="4" w:space="0" w:color="CCCCCC"/>
-            </w:tcBorders>
-          </w:tcPr>
-          <w:p>
-            <w:pPr>
-              <w:spacing w:before="60" w:after="60"/>
-            </w:pPr>
-            <w:r>
-              <w:rPr>
-                <w:rFonts w:ascii="Times New Roman" w:hAnsi="Times New Roman"/>
-                <w:sz w:val="22"/>
-              </w:rPr>
-              <w:t>**100% Hoàn thành**</w:t>
-            </w:r>
-          </w:p>
-        </w:tc>
-        <w:tc>
-          <w:tcPr>
-            <w:tcW w:w="2400" w:type="dxa"/>
-            <w:tcBorders>
-              <w:top w:val="single" w:sz="4" w:space="0" w:color="CCCCCC"/>
-              <w:bottom w:val="single" w:sz="4" w:space="0" w:color="CCCCCC"/>
-            </w:tcBorders>
-          </w:tcPr>
-          <w:p>
-            <w:pPr>
-              <w:spacing w:before="60" w:after="60"/>
-            </w:pPr>
-            <w:r>
-              <w:rPr>
-                <w:rFonts w:ascii="Times New Roman" w:hAnsi="Times New Roman"/>
-                <w:sz w:val="22"/>
-              </w:rPr>
-              <w:t>Đầy đủ giao diện responsive, 6 ngành hàng, giỏ hàng AJAX, checkout VietQR.</w:t>
-            </w:r>
-          </w:p>
-        </w:tc>
-      </w:tr>
-    </w:tbl>
-    <w:tbl>
-      <w:tblPr>
-        <w:tblW w:w="9600" w:type="dxa"/>
-        <w:jc w:val="center"/>
-      </w:tblPr>
-      <w:tr>
-        <w:tc>
-          <w:tcPr>
-            <w:tcW w:w="2400" w:type="dxa"/>
-            <w:tcBorders>
-              <w:top w:val="single" w:sz="4" w:space="0" w:color="CCCCCC"/>
-              <w:bottom w:val="single" w:sz="4" w:space="0" w:color="CCCCCC"/>
-            </w:tcBorders>
-          </w:tcPr>
-          <w:p>
-            <w:pPr>
-              <w:spacing w:before="60" w:after="60"/>
-            </w:pPr>
-            <w:r>
-              <w:rPr>
-                <w:rFonts w:ascii="Times New Roman" w:hAnsi="Times New Roman"/>
-                <w:sz w:val="22"/>
-              </w:rPr>
-              <w:t>Kiến trúc Hybrid PHP kết hợp Rust Engine</w:t>
-            </w:r>
-          </w:p>
-        </w:tc>
-        <w:tc>
-          <w:tcPr>
-            <w:tcW w:w="2400" w:type="dxa"/>
-            <w:tcBorders>
-              <w:top w:val="single" w:sz="4" w:space="0" w:color="CCCCCC"/>
-              <w:bottom w:val="single" w:sz="4" w:space="0" w:color="CCCCCC"/>
-            </w:tcBorders>
-          </w:tcPr>
-          <w:p>
-            <w:pPr>
-              <w:spacing w:before="60" w:after="60"/>
-            </w:pPr>
-            <w:r>
-              <w:rPr>
-                <w:rFonts w:ascii="Times New Roman" w:hAnsi="Times New Roman"/>
-                <w:sz w:val="22"/>
-              </w:rPr>
-              <w:t>**100% Hoàn thành**</w:t>
-            </w:r>
-          </w:p>
-        </w:tc>
-        <w:tc>
-          <w:tcPr>
-            <w:tcW w:w="2400" w:type="dxa"/>
-            <w:tcBorders>
-              <w:top w:val="single" w:sz="4" w:space="0" w:color="CCCCCC"/>
-              <w:bottom w:val="single" w:sz="4" w:space="0" w:color="CCCCCC"/>
-            </w:tcBorders>
-          </w:tcPr>
-          <w:p>
-            <w:pPr>
-              <w:spacing w:before="60" w:after="60"/>
-            </w:pPr>
-            <w:r>
-              <w:rPr>
-                <w:rFonts w:ascii="Times New Roman" w:hAnsi="Times New Roman"/>
-                <w:sz w:val="22"/>
-              </w:rPr>
-              <w:t>Dịch vụ Rust độc lập xử lý tìm kiếm, gợi ý, phân tích; giao tiếp qua REST API.</w:t>
-            </w:r>
-          </w:p>
-        </w:tc>
-      </w:tr>
-    </w:tbl>
-    <w:tbl>
-      <w:tblPr>
-        <w:tblW w:w="9600" w:type="dxa"/>
-        <w:jc w:val="center"/>
-      </w:tblPr>
-      <w:tr>
-        <w:tc>
-          <w:tcPr>
-            <w:tcW w:w="2400" w:type="dxa"/>
-            <w:tcBorders>
-              <w:top w:val="single" w:sz="4" w:space="0" w:color="CCCCCC"/>
-              <w:bottom w:val="single" w:sz="4" w:space="0" w:color="CCCCCC"/>
-            </w:tcBorders>
-          </w:tcPr>
-          <w:p>
-            <w:pPr>
-              <w:spacing w:before="60" w:after="60"/>
-            </w:pPr>
-            <w:r>
-              <w:rPr>
-                <w:rFonts w:ascii="Times New Roman" w:hAnsi="Times New Roman"/>
-                <w:sz w:val="22"/>
-              </w:rPr>
-              <w:t>Cơ chế Graceful Fallback dự phòng</w:t>
-            </w:r>
-          </w:p>
-        </w:tc>
-        <w:tc>
-          <w:tcPr>
-            <w:tcW w:w="2400" w:type="dxa"/>
-            <w:tcBorders>
-              <w:top w:val="single" w:sz="4" w:space="0" w:color="CCCCCC"/>
-              <w:bottom w:val="single" w:sz="4" w:space="0" w:color="CCCCCC"/>
-            </w:tcBorders>
-          </w:tcPr>
-          <w:p>
-            <w:pPr>
-              <w:spacing w:before="60" w:after="60"/>
-            </w:pPr>
-            <w:r>
-              <w:rPr>
-                <w:rFonts w:ascii="Times New Roman" w:hAnsi="Times New Roman"/>
-                <w:sz w:val="22"/>
-              </w:rPr>
-              <w:t>**100% Hoàn thành**</w:t>
-            </w:r>
-          </w:p>
-        </w:tc>
-        <w:tc>
-          <w:tcPr>
-            <w:tcW w:w="2400" w:type="dxa"/>
-            <w:tcBorders>
-              <w:top w:val="single" w:sz="4" w:space="0" w:color="CCCCCC"/>
-              <w:bottom w:val="single" w:sz="4" w:space="0" w:color="CCCCCC"/>
-            </w:tcBorders>
-          </w:tcPr>
-          <w:p>
-            <w:pPr>
-              <w:spacing w:before="60" w:after="60"/>
-            </w:pPr>
-            <w:r>
-              <w:rPr>
-                <w:rFonts w:ascii="Times New Roman" w:hAnsi="Times New Roman"/>
-                <w:sz w:val="22"/>
-              </w:rPr>
-              <w:t>Tự động chuyển sang thuật toán PHP nội bộ khi Rust tắt, không phát sinh lỗi.</w:t>
-            </w:r>
-          </w:p>
-        </w:tc>
-      </w:tr>
-    </w:tbl>
-    <w:tbl>
-      <w:tblPr>
-        <w:tblW w:w="9600" w:type="dxa"/>
-        <w:jc w:val="center"/>
-      </w:tblPr>
-      <w:tr>
-        <w:tc>
-          <w:tcPr>
-            <w:tcW w:w="2400" w:type="dxa"/>
-            <w:tcBorders>
-              <w:top w:val="single" w:sz="4" w:space="0" w:color="CCCCCC"/>
-              <w:bottom w:val="single" w:sz="4" w:space="0" w:color="CCCCCC"/>
-            </w:tcBorders>
-          </w:tcPr>
-          <w:p>
-            <w:pPr>
-              <w:spacing w:before="60" w:after="60"/>
-            </w:pPr>
-            <w:r>
-              <w:rPr>
-                <w:rFonts w:ascii="Times New Roman" w:hAnsi="Times New Roman"/>
-                <w:sz w:val="22"/>
-              </w:rPr>
-              <w:t>Khả năng chạy Portable trên máy trường</w:t>
-            </w:r>
-          </w:p>
-        </w:tc>
-        <w:tc>
-          <w:tcPr>
-            <w:tcW w:w="2400" w:type="dxa"/>
-            <w:tcBorders>
-              <w:top w:val="single" w:sz="4" w:space="0" w:color="CCCCCC"/>
-              <w:bottom w:val="single" w:sz="4" w:space="0" w:color="CCCCCC"/>
-            </w:tcBorders>
-          </w:tcPr>
-          <w:p>
-            <w:pPr>
-              <w:spacing w:before="60" w:after="60"/>
-            </w:pPr>
-            <w:r>
-              <w:rPr>
-                <w:rFonts w:ascii="Times New Roman" w:hAnsi="Times New Roman"/>
-                <w:sz w:val="22"/>
-              </w:rPr>
-              <w:t>**100% Hoàn thành**</w:t>
-            </w:r>
-          </w:p>
-        </w:tc>
-        <w:tc>
-          <w:tcPr>
-            <w:tcW w:w="2400" w:type="dxa"/>
-            <w:tcBorders>
-              <w:top w:val="single" w:sz="4" w:space="0" w:color="CCCCCC"/>
-              <w:bottom w:val="single" w:sz="4" w:space="0" w:color="CCCCCC"/>
-            </w:tcBorders>
-          </w:tcPr>
-          <w:p>
-            <w:pPr>
-              <w:spacing w:before="60" w:after="60"/>
-            </w:pPr>
-            <w:r>
-              <w:rPr>
-                <w:rFonts w:ascii="Times New Roman" w:hAnsi="Times New Roman"/>
-                <w:sz w:val="22"/>
-              </w:rPr>
-              <w:t>Hỗ trợ Dual Database (MySQL + SQLite tự động); kịch bản 1-click `start.bat`.</w:t>
-            </w:r>
-          </w:p>
-        </w:tc>
-      </w:tr>
-    </w:tbl>
-    <w:tbl>
-      <w:tblPr>
-        <w:tblW w:w="9600" w:type="dxa"/>
-        <w:jc w:val="center"/>
-      </w:tblPr>
-      <w:tr>
-        <w:tc>
-          <w:tcPr>
-            <w:tcW w:w="2400" w:type="dxa"/>
-            <w:tcBorders>
-              <w:top w:val="single" w:sz="4" w:space="0" w:color="CCCCCC"/>
-              <w:bottom w:val="single" w:sz="4" w:space="0" w:color="CCCCCC"/>
-            </w:tcBorders>
-          </w:tcPr>
-          <w:p>
-            <w:pPr>
-              <w:spacing w:before="60" w:after="60"/>
-            </w:pPr>
-            <w:r>
-              <w:rPr>
-                <w:rFonts w:ascii="Times New Roman" w:hAnsi="Times New Roman"/>
-                <w:sz w:val="22"/>
-              </w:rPr>
-              <w:t>Tự động hóa CI/CD với GitHub Actions</w:t>
-            </w:r>
-          </w:p>
-        </w:tc>
-        <w:tc>
-          <w:tcPr>
-            <w:tcW w:w="2400" w:type="dxa"/>
-            <w:tcBorders>
-              <w:top w:val="single" w:sz="4" w:space="0" w:color="CCCCCC"/>
-              <w:bottom w:val="single" w:sz="4" w:space="0" w:color="CCCCCC"/>
-            </w:tcBorders>
-          </w:tcPr>
-          <w:p>
-            <w:pPr>
-              <w:spacing w:before="60" w:after="60"/>
-            </w:pPr>
-            <w:r>
-              <w:rPr>
-                <w:rFonts w:ascii="Times New Roman" w:hAnsi="Times New Roman"/>
-                <w:sz w:val="22"/>
-              </w:rPr>
-              <w:t>**100% Hoàn thành**</w:t>
-            </w:r>
-          </w:p>
-        </w:tc>
-        <w:tc>
-          <w:tcPr>
-            <w:tcW w:w="2400" w:type="dxa"/>
-            <w:tcBorders>
-              <w:top w:val="single" w:sz="4" w:space="0" w:color="CCCCCC"/>
-              <w:bottom w:val="single" w:sz="4" w:space="0" w:color="CCCCCC"/>
-            </w:tcBorders>
-          </w:tcPr>
-          <w:p>
-            <w:pPr>
-              <w:spacing w:before="60" w:after="60"/>
-            </w:pPr>
-            <w:r>
-              <w:rPr>
-                <w:rFonts w:ascii="Times New Roman" w:hAnsi="Times New Roman"/>
-                <w:sz w:val="22"/>
-              </w:rPr>
-              <w:t>Pipeline kiểm thử PHP và biên dịch chéo Rust nhị phân cho cả Windows và Linux.</w:t>
-            </w:r>
-          </w:p>
-        </w:tc>
-      </w:tr>
-    </w:tbl>
-    <w:tbl>
-      <w:tblPr>
-        <w:tblW w:w="9600" w:type="dxa"/>
-        <w:jc w:val="center"/>
-      </w:tblPr>
-      <w:tr>
-        <w:tc>
-          <w:tcPr>
-            <w:tcW w:w="2400" w:type="dxa"/>
-            <w:tcBorders>
-              <w:top w:val="single" w:sz="4" w:space="0" w:color="CCCCCC"/>
-              <w:bottom w:val="single" w:sz="4" w:space="0" w:color="CCCCCC"/>
-            </w:tcBorders>
-          </w:tcPr>
-          <w:p>
-            <w:pPr>
-              <w:spacing w:before="60" w:after="60"/>
-            </w:pPr>
-            <w:r>
-              <w:rPr>
-                <w:rFonts w:ascii="Times New Roman" w:hAnsi="Times New Roman"/>
-                <w:sz w:val="22"/>
-              </w:rPr>
               <w:t>Thuật toán thông minh (Cosine, Levenshtein, ABC)</w:t>
             </w:r>
           </w:p>
@@ -12656,7 +12565,7 @@
                 <w:rFonts w:ascii="Times New Roman" w:hAnsi="Times New Roman"/>
                 <w:sz w:val="22"/>
               </w:rPr>
-              <w:t>**100% Hoàn thành**</w:t>
+              <w:t>**Hoàn thành tốt**</w:t>
             </w:r>
           </w:p>
         </w:tc>
@@ -13240,7 +13149,7 @@
           <w:rFonts w:ascii="Times New Roman" w:hAnsi="Times New Roman"/>
           <w:sz w:val="26"/>
         </w:rPr>
-        <w:t>"worker_threads": 4</w:t>
+        <w:t>"worker_threads": 1</w:t>
       </w:r>
     </w:p>
     <w:p>

</xml_diff>

<commit_message>
fix(review,security): fix profile CSRF, coupon chips, soft-delete order validation & sync docs
</commit_message>
<xml_diff>
--- a/Bao_cao_DATN_Website_Thuong_Mai_Dien_Tu_Thiet_Bi_Dien_Tu.docx
+++ b/Bao_cao_DATN_Website_Thuong_Mai_Dien_Tu_Thiet_Bi_Dien_Tu.docx
@@ -4029,7 +4029,7 @@
                 <w:rFonts w:ascii="Times New Roman" w:hAnsi="Times New Roman"/>
                 <w:sz w:val="22"/>
               </w:rPr>
-              <w:t>Gửi đánh giá số sao (1-5 sao) và nhận xét trải nghiệm sau khi trải nghiệm sản phẩm.</w:t>
+              <w:t>Gửi đánh giá số sao (1-5 sao) và nhận xét trải nghiệm (chỉ khách hàng đã nhận hàng thành công mới được đánh giá để đảm bảo tính xác thực).</w:t>
             </w:r>
           </w:p>
         </w:tc>
@@ -4213,7 +4213,7 @@
                 <w:rFonts w:ascii="Times New Roman" w:hAnsi="Times New Roman"/>
                 <w:sz w:val="22"/>
               </w:rPr>
-              <w:t>Thêm mới, chỉnh sửa thông số kỹ thuật, cập nhật giá bán, số lượng tồn kho và xóa sản phẩm.</w:t>
+              <w:t>Thêm mới, chỉnh sửa thông số kỹ thuật, cập nhật giá bán, số lượng tồn kho và chuyển trạng thái ngừng kinh doanh (soft delete an toàn bảo toàn khóa ngoại đơn hàng).</w:t>
             </w:r>
           </w:p>
         </w:tc>
@@ -7589,7 +7589,7 @@
           <w:rFonts w:ascii="Times New Roman" w:hAnsi="Times New Roman"/>
           <w:sz w:val="26"/>
         </w:rPr>
-        <w:t>8. **`coupons` (Mã khuyến mãi):** `id`, `code`, `discount_type` ('fixed', 'percent'), `discount_value`, `min_order_value`, `expires_at`, `status`.</w:t>
+        <w:t>8. **`coupons` (Mã khuyến mãi):** `id`, `code`, `discount_type` ('fixed', 'percent'), `discount_value`, `min_order_value`, `expires_at`, `usage_limit`, `used_count`, `status`.</w:t>
       </w:r>
     </w:p>
     <w:p>
@@ -8570,7 +8570,7 @@
           <w:rFonts w:ascii="Times New Roman" w:hAnsi="Times New Roman"/>
           <w:sz w:val="24"/>
         </w:rPr>
-        <w:t>• **Giỏ hàng &amp; Thanh toán:** Thêm/sửa/xóa sản phẩm bằng AJAX, áp dụng mã khuyến mãi (`WELCOME2026`, `TECHSALE10`), lựa chọn thanh toán COD hoặc hiển thị mã VietQR động để quét chuyển khoản tự động.</w:t>
+        <w:t>• **Giỏ hàng &amp; Thanh toán:** Thêm/sửa/xóa sản phẩm bằng AJAX, áp dụng mã khuyến mãi (`WELCOME2026`, `TECHSALE10`), lựa chọn thanh toán COD hoặc hiển thị mã VietQR động để quét chuyển khoản thuận tiện.</w:t>
       </w:r>
     </w:p>
     <w:p>
@@ -8624,7 +8624,7 @@
           <w:rFonts w:ascii="Times New Roman" w:hAnsi="Times New Roman"/>
           <w:sz w:val="24"/>
         </w:rPr>
-        <w:t>• **Quản lý sản phẩm:** Thêm thiết bị mới với biểu mẫu thông số kỹ thuật hoàn chỉnh, cập nhật giá bán, số lượng tồn kho và xóa sản phẩm.</w:t>
+        <w:t>• **Quản lý sản phẩm:** Thêm thiết bị mới với biểu mẫu thông số kỹ thuật hoàn chỉnh, cập nhật giá bán, số lượng tồn kho và chuyển trạng thái sang ngừng kinh doanh (soft delete an toàn bảo toàn dữ liệu đơn hàng).</w:t>
       </w:r>
     </w:p>
     <w:p>

</xml_diff>